<commit_message>
resume: update May 2026 portfolio resume with full master content
Restores all Sky Ranch bullets, both Highland bullets, full SAP project
entry with teammate names and live site, full double major title, and
complete skills section.

Co-Authored-By: Claude Sonnet 4.6 <noreply@anthropic.com>
</commit_message>
<xml_diff>
--- a/Jax_Johnson_Resume_May2026.docx
+++ b/Jax_Johnson_Resume_May2026.docx
@@ -60,7 +60,7 @@
           <w:sz w:val="20"/>
           <w:szCs w:val="20"/>
         </w:rPr>
-        <w:t xml:space="preserve">Sports sales student with experience in full-cycle ticket sales, CRM-driven prospecting, and in-arena fan engagement at the collegiate and professional levels. Proven ability to exceed outbound activity goals, overcome objections, and build lasting client relationships in fast-paced environments. Passionate about growing as a sales leader in the NBA with a coachable, team-first approach.</w:t>
+        <w:t xml:space="preserve">Sports sales and social media marketing student at Baylor University with hands-on experience in enterprise web development, CRM-driven outreach, and data-informed content strategy. Proven ability to deliver measurable results: 1st place overall in a competitive SAP sponsorship challenge, 14M+ TikTok views in 120 days, and 267 GitHub commits on a full-stack business website. Skilled in building athlete and brand partnerships through creative, analytics-backed campaigns.</w:t>
       </w:r>
     </w:p>
     <w:p>
@@ -147,7 +147,7 @@
           <w:sz w:val="20"/>
           <w:szCs w:val="20"/>
         </w:rPr>
-        <w:t xml:space="preserve">Double Major: MIS and Sales Strategy in Sports and Entertainment Marketing</w:t>
+        <w:t xml:space="preserve">Double Major: Management Information Systems and Sales Strategy in Sports and Entertainment Marketing</w:t>
       </w:r>
     </w:p>
     <w:p>
@@ -219,7 +219,7 @@
           <w:sz w:val="20"/>
           <w:szCs w:val="20"/>
         </w:rPr>
-        <w:t xml:space="preserve">Ticket Sales, San Antonio Spurs Sales Project</w:t>
+        <w:t xml:space="preserve">Social Media Intern</w:t>
       </w:r>
       <w:r>
         <w:rPr>
@@ -247,7 +247,7 @@
           <w:sz w:val="20"/>
           <w:szCs w:val="20"/>
         </w:rPr>
-        <w:t xml:space="preserve">Baylor S3E Sports Sales Program</w:t>
+        <w:t xml:space="preserve">Baylor University &amp; ESPN Central Texas</w:t>
       </w:r>
       <w:r>
         <w:rPr>
@@ -275,43 +275,61 @@
           <w:sz w:val="20"/>
           <w:szCs w:val="20"/>
         </w:rPr>
-        <w:t xml:space="preserve">Executed high-volume outbound calls prospecting season ticket memberships and group packages for the 'Spurs in Austin' game</w:t>
-      </w:r>
-    </w:p>
-    <w:p>
-      <w:pPr>
-        <w:pStyle w:val="ListParagraph"/>
-        <w:numPr>
-          <w:ilvl w:val="0"/>
-          <w:numId w:val="2"/>
-        </w:numPr>
-        <w:spacing w:after="28" w:before="0"/>
-      </w:pPr>
-      <w:r>
-        <w:rPr>
-          <w:rFonts w:ascii="Arial" w:cs="Arial" w:eastAsia="Arial" w:hAnsi="Arial"/>
-          <w:sz w:val="20"/>
-          <w:szCs w:val="20"/>
-        </w:rPr>
-        <w:t xml:space="preserve">Managed a full-cycle CRM pipeline tracking 100+ leads, scheduling seat visits, and nurturing client relationships toward close</w:t>
-      </w:r>
-    </w:p>
-    <w:p>
-      <w:pPr>
-        <w:pStyle w:val="ListParagraph"/>
-        <w:numPr>
-          <w:ilvl w:val="0"/>
-          <w:numId w:val="2"/>
-        </w:numPr>
-        <w:spacing w:after="28" w:before="0"/>
-      </w:pPr>
-      <w:r>
-        <w:rPr>
-          <w:rFonts w:ascii="Arial" w:cs="Arial" w:eastAsia="Arial" w:hAnsi="Arial"/>
-          <w:sz w:val="20"/>
-          <w:szCs w:val="20"/>
-        </w:rPr>
-        <w:t xml:space="preserve">Exceeded weekly activity goals by overcoming objections and delivering tailored membership pitches across a 5-week campaign</w:t>
+        <w:t xml:space="preserve">Produced original behind-the-scenes content for 'All-University Sing,' conducting on-camera interviews for student engagement</w:t>
+      </w:r>
+    </w:p>
+    <w:p>
+      <w:pPr>
+        <w:pStyle w:val="ListParagraph"/>
+        <w:numPr>
+          <w:ilvl w:val="0"/>
+          <w:numId w:val="2"/>
+        </w:numPr>
+        <w:spacing w:after="28" w:before="0"/>
+      </w:pPr>
+      <w:r>
+        <w:rPr>
+          <w:rFonts w:ascii="Arial" w:cs="Arial" w:eastAsia="Arial" w:hAnsi="Arial"/>
+          <w:sz w:val="20"/>
+          <w:szCs w:val="20"/>
+        </w:rPr>
+        <w:t xml:space="preserve">Managed event-specific social strategy, leveraging platform trends and creative techniques aligned with university brand policies</w:t>
+      </w:r>
+    </w:p>
+    <w:p>
+      <w:pPr>
+        <w:pStyle w:val="ListParagraph"/>
+        <w:numPr>
+          <w:ilvl w:val="0"/>
+          <w:numId w:val="2"/>
+        </w:numPr>
+        <w:spacing w:after="28" w:before="0"/>
+      </w:pPr>
+      <w:r>
+        <w:rPr>
+          <w:rFonts w:ascii="Arial" w:cs="Arial" w:eastAsia="Arial" w:hAnsi="Arial"/>
+          <w:sz w:val="20"/>
+          <w:szCs w:val="20"/>
+        </w:rPr>
+        <w:t xml:space="preserve">Attended in-studio and live on-air sessions creating content that reflects the brand identity of ESPN and GBE Sports</w:t>
+      </w:r>
+    </w:p>
+    <w:p>
+      <w:pPr>
+        <w:pStyle w:val="ListParagraph"/>
+        <w:numPr>
+          <w:ilvl w:val="0"/>
+          <w:numId w:val="2"/>
+        </w:numPr>
+        <w:spacing w:after="28" w:before="0"/>
+      </w:pPr>
+      <w:r>
+        <w:rPr>
+          <w:rFonts w:ascii="Arial" w:cs="Arial" w:eastAsia="Arial" w:hAnsi="Arial"/>
+          <w:sz w:val="20"/>
+          <w:szCs w:val="20"/>
+        </w:rPr>
+        <w:t xml:space="preserve">Acquired media passes for games at Baylor, Texas A&amp;M University, and local high schools to gather field content</w:t>
       </w:r>
     </w:p>
     <w:p>
@@ -329,7 +347,7 @@
           <w:sz w:val="20"/>
           <w:szCs w:val="20"/>
         </w:rPr>
-        <w:t xml:space="preserve">Social Media Intern</w:t>
+        <w:t xml:space="preserve">Ticket Sales, San Antonio Spurs Sales Project</w:t>
       </w:r>
       <w:r>
         <w:rPr>
@@ -357,7 +375,7 @@
           <w:sz w:val="20"/>
           <w:szCs w:val="20"/>
         </w:rPr>
-        <w:t xml:space="preserve">Baylor University &amp; ESPN Central Texas</w:t>
+        <w:t xml:space="preserve">Baylor S3E Sports Sales Program</w:t>
       </w:r>
       <w:r>
         <w:rPr>
@@ -385,61 +403,43 @@
           <w:sz w:val="20"/>
           <w:szCs w:val="20"/>
         </w:rPr>
-        <w:t xml:space="preserve">Engaged fans on-site at Baylor, Texas A&amp;M, and local HS games, acquiring media passes and providing in-arena coverage</w:t>
-      </w:r>
-    </w:p>
-    <w:p>
-      <w:pPr>
-        <w:pStyle w:val="ListParagraph"/>
-        <w:numPr>
-          <w:ilvl w:val="0"/>
-          <w:numId w:val="2"/>
-        </w:numPr>
-        <w:spacing w:after="28" w:before="0"/>
-      </w:pPr>
-      <w:r>
-        <w:rPr>
-          <w:rFonts w:ascii="Arial" w:cs="Arial" w:eastAsia="Arial" w:hAnsi="Arial"/>
-          <w:sz w:val="20"/>
-          <w:szCs w:val="20"/>
-        </w:rPr>
-        <w:t xml:space="preserve">Delivered customer-facing content in live, fast-paced settings representing the ESPN and GBE Sports brands at events</w:t>
-      </w:r>
-    </w:p>
-    <w:p>
-      <w:pPr>
-        <w:pStyle w:val="ListParagraph"/>
-        <w:numPr>
-          <w:ilvl w:val="0"/>
-          <w:numId w:val="2"/>
-        </w:numPr>
-        <w:spacing w:after="28" w:before="0"/>
-      </w:pPr>
-      <w:r>
-        <w:rPr>
-          <w:rFonts w:ascii="Arial" w:cs="Arial" w:eastAsia="Arial" w:hAnsi="Arial"/>
-          <w:sz w:val="20"/>
-          <w:szCs w:val="20"/>
-        </w:rPr>
-        <w:t xml:space="preserve">Managed event-specific social strategy and attended in-studio sessions, building experience across multiple sports properties</w:t>
-      </w:r>
-    </w:p>
-    <w:p>
-      <w:pPr>
-        <w:pStyle w:val="ListParagraph"/>
-        <w:numPr>
-          <w:ilvl w:val="0"/>
-          <w:numId w:val="2"/>
-        </w:numPr>
-        <w:spacing w:after="28" w:before="0"/>
-      </w:pPr>
-      <w:r>
-        <w:rPr>
-          <w:rFonts w:ascii="Arial" w:cs="Arial" w:eastAsia="Arial" w:hAnsi="Arial"/>
-          <w:sz w:val="20"/>
-          <w:szCs w:val="20"/>
-        </w:rPr>
-        <w:t xml:space="preserve">Produced behind-the-scenes content and conducted on-camera interviews, demonstrating verbal communication and adaptability</w:t>
+        <w:t xml:space="preserve">Executed high-volume outbound calls prospecting season ticket memberships and group packages for the 'Spurs in Austin' game</w:t>
+      </w:r>
+    </w:p>
+    <w:p>
+      <w:pPr>
+        <w:pStyle w:val="ListParagraph"/>
+        <w:numPr>
+          <w:ilvl w:val="0"/>
+          <w:numId w:val="2"/>
+        </w:numPr>
+        <w:spacing w:after="28" w:before="0"/>
+      </w:pPr>
+      <w:r>
+        <w:rPr>
+          <w:rFonts w:ascii="Arial" w:cs="Arial" w:eastAsia="Arial" w:hAnsi="Arial"/>
+          <w:sz w:val="20"/>
+          <w:szCs w:val="20"/>
+        </w:rPr>
+        <w:t xml:space="preserve">Managed a full-cycle CRM pipeline tracking 100+ leads, scheduling seat visits, and nurturing client relationships toward close</w:t>
+      </w:r>
+    </w:p>
+    <w:p>
+      <w:pPr>
+        <w:pStyle w:val="ListParagraph"/>
+        <w:numPr>
+          <w:ilvl w:val="0"/>
+          <w:numId w:val="2"/>
+        </w:numPr>
+        <w:spacing w:after="28" w:before="0"/>
+      </w:pPr>
+      <w:r>
+        <w:rPr>
+          <w:rFonts w:ascii="Arial" w:cs="Arial" w:eastAsia="Arial" w:hAnsi="Arial"/>
+          <w:sz w:val="20"/>
+          <w:szCs w:val="20"/>
+        </w:rPr>
+        <w:t xml:space="preserve">Exceeded weekly activity goals by overcoming objections and delivering tailored membership pitches across a 5-week campaign</w:t>
       </w:r>
     </w:p>
     <w:p>
@@ -531,25 +531,25 @@
           <w:sz w:val="20"/>
           <w:szCs w:val="20"/>
         </w:rPr>
-        <w:t xml:space="preserve">Applied descriptive analytics to optimize engagement and scheduling, mirroring the metrics-driven mindset for ticket sales</w:t>
-      </w:r>
-    </w:p>
-    <w:p>
-      <w:pPr>
-        <w:pStyle w:val="ListParagraph"/>
-        <w:numPr>
-          <w:ilvl w:val="0"/>
-          <w:numId w:val="2"/>
-        </w:numPr>
-        <w:spacing w:after="28" w:before="0"/>
-      </w:pPr>
-      <w:r>
-        <w:rPr>
-          <w:rFonts w:ascii="Arial" w:cs="Arial" w:eastAsia="Arial" w:hAnsi="Arial"/>
-          <w:sz w:val="20"/>
-          <w:szCs w:val="20"/>
-        </w:rPr>
-        <w:t xml:space="preserve">Collaborated on cross-promotional campaigns to improve lead generation and drive revenue across multiple brand partnerships</w:t>
+        <w:t xml:space="preserve">Collaborated on cross-promotional campaigns to increase revenue, improve lead generation, and deliver measurable growth</w:t>
+      </w:r>
+    </w:p>
+    <w:p>
+      <w:pPr>
+        <w:pStyle w:val="ListParagraph"/>
+        <w:numPr>
+          <w:ilvl w:val="0"/>
+          <w:numId w:val="2"/>
+        </w:numPr>
+        <w:spacing w:after="28" w:before="0"/>
+      </w:pPr>
+      <w:r>
+        <w:rPr>
+          <w:rFonts w:ascii="Arial" w:cs="Arial" w:eastAsia="Arial" w:hAnsi="Arial"/>
+          <w:sz w:val="20"/>
+          <w:szCs w:val="20"/>
+        </w:rPr>
+        <w:t xml:space="preserve">Utilized descriptive statistics to analyze data, increase audience engagement, and optimize content scheduling</w:t>
       </w:r>
     </w:p>
     <w:p>
@@ -567,7 +567,7 @@
           <w:sz w:val="20"/>
           <w:szCs w:val="20"/>
         </w:rPr>
-        <w:t xml:space="preserve">Camp Counselor, Work Crew, Senior &amp; Leadership Counselor</w:t>
+        <w:t xml:space="preserve">Day Camp Counselor, Work Crew, Senior Counselor, Leadership Counselor</w:t>
       </w:r>
       <w:r>
         <w:rPr>
@@ -623,25 +623,61 @@
           <w:sz w:val="20"/>
           <w:szCs w:val="20"/>
         </w:rPr>
-        <w:t xml:space="preserve">Selected 4x for competitive leadership roles; built coachability, team-first attitude, and composure through 500+ service hours</w:t>
-      </w:r>
-    </w:p>
-    <w:p>
-      <w:pPr>
-        <w:pStyle w:val="ListParagraph"/>
-        <w:numPr>
-          <w:ilvl w:val="0"/>
-          <w:numId w:val="2"/>
-        </w:numPr>
-        <w:spacing w:after="28" w:before="0"/>
-      </w:pPr>
-      <w:r>
-        <w:rPr>
-          <w:rFonts w:ascii="Arial" w:cs="Arial" w:eastAsia="Arial" w:hAnsi="Arial"/>
-          <w:sz w:val="20"/>
-          <w:szCs w:val="20"/>
-        </w:rPr>
-        <w:t xml:space="preserve">Led small groups and facilitated activities for 200+ participants, demonstrating communication skills and flexibility under pressure</w:t>
+        <w:t xml:space="preserve">Selected as 1 of 2 high schoolers on the Day Camp team; assisted activities for 200+ campers across 9-hour days</w:t>
+      </w:r>
+    </w:p>
+    <w:p>
+      <w:pPr>
+        <w:pStyle w:val="ListParagraph"/>
+        <w:numPr>
+          <w:ilvl w:val="0"/>
+          <w:numId w:val="2"/>
+        </w:numPr>
+        <w:spacing w:after="28" w:before="0"/>
+      </w:pPr>
+      <w:r>
+        <w:rPr>
+          <w:rFonts w:ascii="Arial" w:cs="Arial" w:eastAsia="Arial" w:hAnsi="Arial"/>
+          <w:sz w:val="20"/>
+          <w:szCs w:val="20"/>
+        </w:rPr>
+        <w:t xml:space="preserve">Selected as 1 of 5 for Work Crew; managed logistics, setup, and accumulated 500+ service hours</w:t>
+      </w:r>
+    </w:p>
+    <w:p>
+      <w:pPr>
+        <w:pStyle w:val="ListParagraph"/>
+        <w:numPr>
+          <w:ilvl w:val="0"/>
+          <w:numId w:val="2"/>
+        </w:numPr>
+        <w:spacing w:after="28" w:before="0"/>
+      </w:pPr>
+      <w:r>
+        <w:rPr>
+          <w:rFonts w:ascii="Arial" w:cs="Arial" w:eastAsia="Arial" w:hAnsi="Arial"/>
+          <w:sz w:val="20"/>
+          <w:szCs w:val="20"/>
+        </w:rPr>
+        <w:t xml:space="preserve">Selected as 1 of 5 freshmen for Senior Counselor; led small groups and guided peer activities</w:t>
+      </w:r>
+    </w:p>
+    <w:p>
+      <w:pPr>
+        <w:pStyle w:val="ListParagraph"/>
+        <w:numPr>
+          <w:ilvl w:val="0"/>
+          <w:numId w:val="2"/>
+        </w:numPr>
+        <w:spacing w:after="28" w:before="0"/>
+      </w:pPr>
+      <w:r>
+        <w:rPr>
+          <w:rFonts w:ascii="Arial" w:cs="Arial" w:eastAsia="Arial" w:hAnsi="Arial"/>
+          <w:sz w:val="20"/>
+          <w:szCs w:val="20"/>
+        </w:rPr>
+        <w:t xml:space="preserve">Selected as 1 of 5 sophomores for Leadership track; facilitated personal growth, supported staff, and fostered discipleship</w:t>
       </w:r>
     </w:p>
     <w:p>
@@ -733,43 +769,61 @@
           <w:sz w:val="20"/>
           <w:szCs w:val="20"/>
         </w:rPr>
-        <w:t xml:space="preserve">Earned 1st place overall; strategy judged by executives from SAP, Playfly Sports, and SBRnet across both class sections</w:t>
-      </w:r>
-    </w:p>
-    <w:p>
-      <w:pPr>
-        <w:pStyle w:val="ListParagraph"/>
-        <w:numPr>
-          <w:ilvl w:val="0"/>
-          <w:numId w:val="2"/>
-        </w:numPr>
-        <w:spacing w:after="28" w:before="0"/>
-      </w:pPr>
-      <w:r>
-        <w:rPr>
-          <w:rFonts w:ascii="Arial" w:cs="Arial" w:eastAsia="Arial" w:hAnsi="Arial"/>
-          <w:sz w:val="20"/>
-          <w:szCs w:val="20"/>
-        </w:rPr>
-        <w:t xml:space="preserve">Led technical build of an enterprise website from scratch, logging 267 GitHub commits and 80+ hours as lead of a 5-person team</w:t>
-      </w:r>
-    </w:p>
-    <w:p>
-      <w:pPr>
-        <w:pStyle w:val="ListParagraph"/>
-        <w:numPr>
-          <w:ilvl w:val="0"/>
-          <w:numId w:val="2"/>
-        </w:numPr>
-        <w:spacing w:after="28" w:before="0"/>
-      </w:pPr>
-      <w:r>
-        <w:rPr>
-          <w:rFonts w:ascii="Arial" w:cs="Arial" w:eastAsia="Arial" w:hAnsi="Arial"/>
-          <w:sz w:val="20"/>
-          <w:szCs w:val="20"/>
-        </w:rPr>
-        <w:t xml:space="preserve">Developed a revenue-focused sponsorship plan applicable to professional sports sales and partnership environments</w:t>
+        <w:t xml:space="preserve">Built an enterprise-grade website from scratch in lieu of a traditional presentation, logging 267 GitHub commits and 80+ personal hours</w:t>
+      </w:r>
+    </w:p>
+    <w:p>
+      <w:pPr>
+        <w:pStyle w:val="ListParagraph"/>
+        <w:numPr>
+          <w:ilvl w:val="0"/>
+          <w:numId w:val="2"/>
+        </w:numPr>
+        <w:spacing w:after="28" w:before="0"/>
+      </w:pPr>
+      <w:r>
+        <w:rPr>
+          <w:rFonts w:ascii="Arial" w:cs="Arial" w:eastAsia="Arial" w:hAnsi="Arial"/>
+          <w:sz w:val="20"/>
+          <w:szCs w:val="20"/>
+        </w:rPr>
+        <w:t xml:space="preserve">Earned 1st place overall across both class sections, judged by executives from SAP, Playfly Sports, and SBRnet</w:t>
+      </w:r>
+    </w:p>
+    <w:p>
+      <w:pPr>
+        <w:pStyle w:val="ListParagraph"/>
+        <w:numPr>
+          <w:ilvl w:val="0"/>
+          <w:numId w:val="2"/>
+        </w:numPr>
+        <w:spacing w:after="28" w:before="0"/>
+      </w:pPr>
+      <w:r>
+        <w:rPr>
+          <w:rFonts w:ascii="Arial" w:cs="Arial" w:eastAsia="Arial" w:hAnsi="Arial"/>
+          <w:sz w:val="20"/>
+          <w:szCs w:val="20"/>
+        </w:rPr>
+        <w:t xml:space="preserve">Partnered with 4 teammates (Rylee White, Makenna Morrow, Jacob Moore, Maddie Halfmann) to develop a comprehensive SAP sponsorship strategy</w:t>
+      </w:r>
+    </w:p>
+    <w:p>
+      <w:pPr>
+        <w:pStyle w:val="ListParagraph"/>
+        <w:numPr>
+          <w:ilvl w:val="0"/>
+          <w:numId w:val="2"/>
+        </w:numPr>
+        <w:spacing w:after="28" w:before="0"/>
+      </w:pPr>
+      <w:r>
+        <w:rPr>
+          <w:rFonts w:ascii="Arial" w:cs="Arial" w:eastAsia="Arial" w:hAnsi="Arial"/>
+          <w:sz w:val="20"/>
+          <w:szCs w:val="20"/>
+        </w:rPr>
+        <w:t xml:space="preserve">Live site: jax-portfolio.onrender.com  |  github.com/JaxJ12/Portfolio</w:t>
       </w:r>
     </w:p>
     <w:p>
@@ -861,25 +915,25 @@
           <w:sz w:val="20"/>
           <w:szCs w:val="20"/>
         </w:rPr>
-        <w:t xml:space="preserve">Prospected 65 Texas HS DECA programs and 180+ MBA/BBA students using outbound strategies mirroring ticket sales calls</w:t>
-      </w:r>
-    </w:p>
-    <w:p>
-      <w:pPr>
-        <w:pStyle w:val="ListParagraph"/>
-        <w:numPr>
-          <w:ilvl w:val="0"/>
-          <w:numId w:val="2"/>
-        </w:numPr>
-        <w:spacing w:after="28" w:before="0"/>
-      </w:pPr>
-      <w:r>
-        <w:rPr>
-          <w:rFonts w:ascii="Arial" w:cs="Arial" w:eastAsia="Arial" w:hAnsi="Arial"/>
-          <w:sz w:val="20"/>
-          <w:szCs w:val="20"/>
-        </w:rPr>
-        <w:t xml:space="preserve">Designed promotional events to recruit members and drive participation in Baylor S3E competitions</w:t>
+        <w:t xml:space="preserve">Prospected 65 Texas high school DECA programs and contacted 180+ MBA and BBA students to participate in Baylor competitions</w:t>
+      </w:r>
+    </w:p>
+    <w:p>
+      <w:pPr>
+        <w:pStyle w:val="ListParagraph"/>
+        <w:numPr>
+          <w:ilvl w:val="0"/>
+          <w:numId w:val="2"/>
+        </w:numPr>
+        <w:spacing w:after="28" w:before="0"/>
+      </w:pPr>
+      <w:r>
+        <w:rPr>
+          <w:rFonts w:ascii="Arial" w:cs="Arial" w:eastAsia="Arial" w:hAnsi="Arial"/>
+          <w:sz w:val="20"/>
+          <w:szCs w:val="20"/>
+        </w:rPr>
+        <w:t xml:space="preserve">Attended and designed promotional events for the S3E organization, recruiting and informing students on club opportunities</w:t>
       </w:r>
     </w:p>
     <w:p>
@@ -953,7 +1007,25 @@
           <w:sz w:val="20"/>
           <w:szCs w:val="20"/>
         </w:rPr>
-        <w:t xml:space="preserve">Facilitated weekly sessions for 20-30 students and led retreats for 100+, demonstrating commitment to team culture and service</w:t>
+        <w:t xml:space="preserve">Facilitated weekly discussion for 20-30 high school juniors, contributing to biblical conversations on Sunday mornings</w:t>
+      </w:r>
+    </w:p>
+    <w:p>
+      <w:pPr>
+        <w:pStyle w:val="ListParagraph"/>
+        <w:numPr>
+          <w:ilvl w:val="0"/>
+          <w:numId w:val="2"/>
+        </w:numPr>
+        <w:spacing w:after="28" w:before="0"/>
+      </w:pPr>
+      <w:r>
+        <w:rPr>
+          <w:rFonts w:ascii="Arial" w:cs="Arial" w:eastAsia="Arial" w:hAnsi="Arial"/>
+          <w:sz w:val="20"/>
+          <w:szCs w:val="20"/>
+        </w:rPr>
+        <w:t xml:space="preserve">Attended weekend retreats, aiding spiritual growth for 100+ high schoolers through scripture-centered programming</w:t>
       </w:r>
     </w:p>
     <w:p>
@@ -994,7 +1066,7 @@
           <w:sz w:val="20"/>
           <w:szCs w:val="20"/>
         </w:rPr>
-        <w:t xml:space="preserve">CRM (Salesforce 25K+, HubSpot), Ticket Sales (Spurs, Hawks), HubSpot SM Marketing Cert, MOS Certified, Python / SQL / SPSS, Web Dev</w:t>
+        <w:t xml:space="preserve">HubSpot Social Media Marketing Certification, MOS Certified, Python / SQL / SPSS (entry-level), Salesforce (25K+), Web Development (HTML, CSS, JavaScript, GitHub)</w:t>
       </w:r>
     </w:p>
     <w:p>
@@ -1040,7 +1112,7 @@
           <w:sz w:val="20"/>
           <w:szCs w:val="20"/>
         </w:rPr>
-        <w:t xml:space="preserve">SAP Sponsorship Challenge (1st Place Overall), Atlanta Hawks Outbound Sales Project, NCSSC Showcase (Top 25), UGC for Creed Bible App</w:t>
+        <w:t xml:space="preserve">SAP Sponsorship Challenge (1st Place Overall), Atlanta Hawks Call Project, NCSSC Showcase (Top 25), UGC Content for Creed Bible App, Brand Content Creator</w:t>
       </w:r>
     </w:p>
     <w:sectPr>

</xml_diff>